<commit_message>
Auto-save: 2 file(s) — 2026-10-15 12:26
</commit_message>
<xml_diff>
--- a/Notes/2026-10-14-xloop-data-ai-consulting-page-content-v1.1.docx
+++ b/Notes/2026-10-14-xloop-data-ai-consulting-page-content-v1.1.docx
@@ -145,13 +145,7 @@
         <w:rPr>
           <w:color w:val="1A1A1A"/>
         </w:rPr>
-        <w:t xml:space="preserve"> the advisory side of data and AI: readiness, data strategy, use case selection, roadmap, governance and the move from pilot to production. Building data</w:t>
-      </w:r>
-      <w:r>
-        <w:rPr>
-          <w:color w:val="1A1A1A"/>
-        </w:rPr>
-        <w:t xml:space="preserve"> platforms belongs to Data Analytics &amp; Engineering, and building models and agents to Applied AI Solutions. </w:t>
+        <w:t xml:space="preserve"> the advisory side of data and AI: readiness, data strategy, use case selection, roadmap, governance and the move from pilot to production. Building data platforms belongs to Data Analytics &amp; Engineering, and building models and agents to Applied AI Solutions. </w:t>
       </w:r>
     </w:p>
     <w:p>
@@ -282,17 +276,7 @@
                 <w:sz w:val="19"/>
                 <w:szCs w:val="19"/>
               </w:rPr>
-              <w:t>Val</w:t>
-            </w:r>
-            <w:r>
-              <w:rPr>
-                <w:b/>
-                <w:bCs/>
-                <w:color w:val="1A1A1A"/>
-                <w:sz w:val="19"/>
-                <w:szCs w:val="19"/>
-              </w:rPr>
-              <w:t>ue</w:t>
+              <w:t>Value</w:t>
             </w:r>
           </w:p>
         </w:tc>
@@ -911,13 +895,7 @@
         <w:rPr>
           <w:color w:val="1A1A1A"/>
         </w:rPr>
-        <w:t xml:space="preserve"> stall because the data isn't ready, the pilot w</w:t>
-      </w:r>
-      <w:r>
-        <w:rPr>
-          <w:color w:val="1A1A1A"/>
-        </w:rPr>
-        <w:t>as never built for production, or nobody can show it is safe. We plan data and AI together: the data foundation your AI needs, the use cases worth funding, and the route from pilot to production.</w:t>
+        <w:t xml:space="preserve"> stall because the data isn't ready, the pilot was never built for production, or nobody can show it is safe. We plan data and AI together: the data foundation your AI needs, the use cases worth funding, and the route from pilot to production.</w:t>
       </w:r>
     </w:p>
     <w:p>
@@ -949,46 +927,32 @@
           <w:bCs/>
           <w:color w:val="1A1A1A"/>
         </w:rPr>
-        <w:t>S</w:t>
-      </w:r>
+        <w:t>Small line under the CTA:</w:t>
+      </w:r>
+      <w:r>
+        <w:rPr>
+          <w:color w:val="1A1A1A"/>
+        </w:rPr>
+        <w:t xml:space="preserve"> We'll look at what you want AI to do, what your data can support today, and where to start.</w:t>
+      </w:r>
+    </w:p>
+    <w:p>
+      <w:pPr>
+        <w:spacing w:after="130" w:line="300" w:lineRule="auto"/>
+      </w:pPr>
       <w:r>
         <w:rPr>
           <w:b/>
           <w:bCs/>
           <w:color w:val="1A1A1A"/>
         </w:rPr>
-        <w:t>mall line under the CTA:</w:t>
-      </w:r>
-      <w:r>
-        <w:rPr>
-          <w:color w:val="1A1A1A"/>
-        </w:rPr>
-        <w:t xml:space="preserve"> We'll look at what you want AI to do, what your data can support today, and where to start.</w:t>
-      </w:r>
-    </w:p>
-    <w:p>
-      <w:pPr>
-        <w:spacing w:after="130" w:line="300" w:lineRule="auto"/>
-      </w:pPr>
-      <w:r>
-        <w:rPr>
-          <w:b/>
-          <w:bCs/>
-          <w:color w:val="1A1A1A"/>
-        </w:rPr>
         <w:t>Trust line (text):</w:t>
       </w:r>
       <w:r>
         <w:rPr>
           <w:color w:val="1A1A1A"/>
         </w:rPr>
-        <w:t xml:space="preserve"> Technology partners: AWS · Microsoft · Snowflake · Databricks · Salesforce · Certified ISO 42001 and ISO 27001 Lead Audi</w:t>
-      </w:r>
-      <w:r>
-        <w:rPr>
-          <w:color w:val="1A1A1A"/>
-        </w:rPr>
-        <w:t>tors on the team</w:t>
+        <w:t xml:space="preserve"> Technology partners: AWS · Microsoft · Snowflake · Databricks · Salesforce · Certified ISO 42001 and ISO 27001 Lead Auditors on the team</w:t>
       </w:r>
     </w:p>
     <w:p>
@@ -1075,13 +1039,7 @@
         <w:rPr>
           <w:color w:val="1A1A1A"/>
         </w:rPr>
-        <w:t xml:space="preserve"> Data and AI Consulti</w:t>
-      </w:r>
-      <w:r>
-        <w:rPr>
-          <w:color w:val="1A1A1A"/>
-        </w:rPr>
-        <w:t>ng?</w:t>
+        <w:t xml:space="preserve"> Data and AI Consulting?</w:t>
       </w:r>
     </w:p>
     <w:p>
@@ -1092,13 +1050,7 @@
         <w:rPr>
           <w:color w:val="1A1A1A"/>
         </w:rPr>
-        <w:t>Data and AI consulting helps an organization decide where AI will pay off and what its data needs to support it. It covers data and AI readiness, data strategy, use case selection, the business case, the roadmap and governance, before and alongside the</w:t>
-      </w:r>
-      <w:r>
-        <w:rPr>
-          <w:color w:val="1A1A1A"/>
-        </w:rPr>
-        <w:t xml:space="preserve"> build. Done well, it reduces experiments and puts the budget behind outcomes you can measure.</w:t>
+        <w:t>Data and AI consulting helps an organization decide where AI will pay off and what its data needs to support it. It covers data and AI readiness, data strategy, use case selection, the business case, the roadmap and governance, before and alongside the build. Done well, it reduces experiments and puts the budget behind outcomes you can measure.</w:t>
       </w:r>
     </w:p>
     <w:p>
@@ -1197,17 +1149,7 @@
           <w:sz w:val="18"/>
           <w:szCs w:val="18"/>
         </w:rPr>
-        <w:t xml:space="preserve"> three pillars, but show the buyer's words, not the pi</w:t>
-      </w:r>
-      <w:r>
-        <w:rPr>
-          <w:i/>
-          <w:iCs/>
-          <w:color w:val="6B7280"/>
-          <w:sz w:val="18"/>
-          <w:szCs w:val="18"/>
-        </w:rPr>
-        <w:t>llar names.</w:t>
+        <w:t xml:space="preserve"> three pillars, but show the buyer's words, not the pillar names.</w:t>
       </w:r>
     </w:p>
     <w:tbl>
@@ -1403,16 +1345,7 @@
                 <w:szCs w:val="19"/>
                 <w:highlight w:val="yellow"/>
               </w:rPr>
-              <w:t>See D</w:t>
-            </w:r>
-            <w:r>
-              <w:rPr>
-                <w:color w:val="1A1A1A"/>
-                <w:sz w:val="19"/>
-                <w:szCs w:val="19"/>
-                <w:highlight w:val="yellow"/>
-              </w:rPr>
-              <w:t>ata Analytics &amp; Engineering (/services/data-analytics)</w:t>
+              <w:t>See Data Analytics &amp; Engineering (/services/data-analytics)</w:t>
             </w:r>
           </w:p>
         </w:tc>
@@ -1508,8 +1441,6 @@
               </w:rPr>
               <w:t xml:space="preserve"> </w:t>
             </w:r>
-            <w:bookmarkStart w:id="0" w:name="_GoBack"/>
-            <w:bookmarkEnd w:id="0"/>
           </w:p>
         </w:tc>
       </w:tr>
@@ -1594,15 +1525,7 @@
                 <w:sz w:val="19"/>
                 <w:szCs w:val="19"/>
               </w:rPr>
-              <w:t>Governance and security testing bu</w:t>
-            </w:r>
-            <w:r>
-              <w:rPr>
-                <w:color w:val="1A1A1A"/>
-                <w:sz w:val="19"/>
-                <w:szCs w:val="19"/>
-              </w:rPr>
-              <w:t>ilt into the plan, not added at the end. See AI Security Services (/services/ai-security-service)</w:t>
+              <w:t>Governance and security testing built into the plan, not added at the end. See AI Security Services (/services/ai-security-service)</w:t>
             </w:r>
           </w:p>
         </w:tc>
@@ -1661,17 +1584,7 @@
           <w:sz w:val="28"/>
           <w:szCs w:val="28"/>
         </w:rPr>
-        <w:t>4. Chal</w:t>
-      </w:r>
-      <w:r>
-        <w:rPr>
-          <w:b/>
-          <w:bCs/>
-          <w:color w:val="1A1A1A"/>
-          <w:sz w:val="28"/>
-          <w:szCs w:val="28"/>
-        </w:rPr>
-        <w:t>lenges we solve · `#challenges`</w:t>
+        <w:t>4. Challenges we solve · `#challenges`</w:t>
       </w:r>
     </w:p>
     <w:p>
@@ -1934,15 +1847,7 @@
                 <w:sz w:val="17"/>
                 <w:szCs w:val="17"/>
               </w:rPr>
-              <w:t>Score every candidate use case on value and feasibility, and pick the few worth fund</w:t>
-            </w:r>
-            <w:r>
-              <w:rPr>
-                <w:color w:val="1A1A1A"/>
-                <w:sz w:val="17"/>
-                <w:szCs w:val="17"/>
-              </w:rPr>
-              <w:t>ing first</w:t>
+              <w:t>Score every candidate use case on value and feasibility, and pick the few worth funding first</w:t>
             </w:r>
           </w:p>
         </w:tc>
@@ -2169,15 +2074,7 @@
                 <w:sz w:val="17"/>
                 <w:szCs w:val="17"/>
               </w:rPr>
-              <w:t>Assess data readiness fo</w:t>
-            </w:r>
-            <w:r>
-              <w:rPr>
-                <w:color w:val="1A1A1A"/>
-                <w:sz w:val="17"/>
-                <w:szCs w:val="17"/>
-              </w:rPr>
-              <w:t>r each priority use case, then set a data strategy: the target architecture, who owns what, and the foundation work in the order the use cases need it</w:t>
+              <w:t>Assess data readiness for each priority use case, then set a data strategy: the target architecture, who owns what, and the foundation work in the order the use cases need it</w:t>
             </w:r>
           </w:p>
         </w:tc>
@@ -2263,15 +2160,7 @@
                 <w:sz w:val="17"/>
                 <w:szCs w:val="17"/>
               </w:rPr>
-              <w:t>No AI policy, no risk assessment, a</w:t>
-            </w:r>
-            <w:r>
-              <w:rPr>
-                <w:color w:val="1A1A1A"/>
-                <w:sz w:val="17"/>
-                <w:szCs w:val="17"/>
-              </w:rPr>
-              <w:t>nd no way to show how the system behaves under attack</w:t>
+              <w:t>No AI policy, no risk assessment, and no way to show how the system behaves under attack</w:t>
             </w:r>
           </w:p>
         </w:tc>
@@ -2384,15 +2273,7 @@
                 <w:sz w:val="17"/>
                 <w:szCs w:val="17"/>
               </w:rPr>
-              <w:t>Use cases described in technical terms, with no</w:t>
-            </w:r>
-            <w:r>
-              <w:rPr>
-                <w:color w:val="1A1A1A"/>
-                <w:sz w:val="17"/>
-                <w:szCs w:val="17"/>
-              </w:rPr>
-              <w:t xml:space="preserve"> baseline, cost model or measure of success</w:t>
+              <w:t>Use cases described in technical terms, with no baseline, cost model or measure of success</w:t>
             </w:r>
           </w:p>
         </w:tc>
@@ -2535,17 +2416,7 @@
           <w:sz w:val="18"/>
           <w:szCs w:val="18"/>
         </w:rPr>
-        <w:t>Design: six services as a horizontal lifecycle on desktop, matching the f</w:t>
-      </w:r>
-      <w:r>
-        <w:rPr>
-          <w:i/>
-          <w:iCs/>
-          <w:color w:val="6B7280"/>
-          <w:sz w:val="18"/>
-          <w:szCs w:val="18"/>
-        </w:rPr>
-        <w:t>low strip, and stacked on mobile.</w:t>
+        <w:t>Design: six services as a horizontal lifecycle on desktop, matching the flow strip, and stacked on mobile.</w:t>
       </w:r>
     </w:p>
     <w:tbl>
@@ -2775,15 +2646,7 @@
                 <w:sz w:val="19"/>
                 <w:szCs w:val="19"/>
               </w:rPr>
-              <w:t>2. Use case discovery and p</w:t>
-            </w:r>
-            <w:r>
-              <w:rPr>
-                <w:color w:val="1A1A1A"/>
-                <w:sz w:val="19"/>
-                <w:szCs w:val="19"/>
-              </w:rPr>
-              <w:t>rioritization</w:t>
+              <w:t>2. Use case discovery and prioritization</w:t>
             </w:r>
           </w:p>
         </w:tc>
@@ -2896,15 +2759,7 @@
                 <w:sz w:val="19"/>
                 <w:szCs w:val="19"/>
               </w:rPr>
-              <w:t>We map where your data sits, how good it is and who owns it. Then we design the target data architecture and plan the foundation work, sequenced by the AI use cases that depend on</w:t>
-            </w:r>
-            <w:r>
-              <w:rPr>
-                <w:color w:val="1A1A1A"/>
-                <w:sz w:val="19"/>
-                <w:szCs w:val="19"/>
-              </w:rPr>
-              <w:t xml:space="preserve"> it</w:t>
+              <w:t>We map where your data sits, how good it is and who owns it. Then we design the target data architecture and plan the foundation work, sequenced by the AI use cases that depend on it</w:t>
             </w:r>
           </w:p>
         </w:tc>
@@ -3017,15 +2872,7 @@
                 <w:sz w:val="19"/>
                 <w:szCs w:val="19"/>
               </w:rPr>
-              <w:t>A roadmap</w:t>
-            </w:r>
-            <w:r>
-              <w:rPr>
-                <w:color w:val="1A1A1A"/>
-                <w:sz w:val="19"/>
-                <w:szCs w:val="19"/>
-              </w:rPr>
-              <w:t xml:space="preserve"> leadership can fund, with milestones and success measures</w:t>
+              <w:t>A roadmap leadership can fund, with milestones and success measures</w:t>
             </w:r>
           </w:p>
         </w:tc>
@@ -3084,15 +2931,7 @@
                 <w:sz w:val="19"/>
                 <w:szCs w:val="19"/>
               </w:rPr>
-              <w:t xml:space="preserve">Data ownership, quality standards and access rules, alongside an AI use policy, a risk assessment for each use case, model accountability and a plan for security testing </w:t>
-            </w:r>
-            <w:r>
-              <w:rPr>
-                <w:color w:val="1A1A1A"/>
-                <w:sz w:val="19"/>
-                <w:szCs w:val="19"/>
-              </w:rPr>
-              <w:t>before launch. Aligned to ISO 42001 practice, with certified Lead Auditors on the team</w:t>
+              <w:t>Data ownership, quality standards and access rules, alongside an AI use policy, a risk assessment for each use case, model accountability and a plan for security testing before launch. Aligned to ISO 42001 practice, with certified Lead Auditors on the team</w:t>
             </w:r>
           </w:p>
         </w:tc>
@@ -3179,15 +3018,7 @@
                 <w:sz w:val="19"/>
                 <w:szCs w:val="19"/>
               </w:rPr>
-              <w:t>We define the pilot's scope and success measures, oversee the build, and plan production</w:t>
-            </w:r>
-            <w:r>
-              <w:rPr>
-                <w:color w:val="1A1A1A"/>
-                <w:sz w:val="19"/>
-                <w:szCs w:val="19"/>
-              </w:rPr>
-              <w:t xml:space="preserve">: integration, monitoring, </w:t>
+              <w:t xml:space="preserve">We define the pilot's scope and success measures, oversee the build, and plan production: integration, monitoring, </w:t>
             </w:r>
             <w:proofErr w:type="spellStart"/>
             <w:r>
@@ -3296,13 +3127,7 @@
         <w:rPr>
           <w:color w:val="1A1A1A"/>
         </w:rPr>
-        <w:t xml:space="preserve"> Building the data platform, pipelines or governance controls? See Data Analytics &amp; Engineering (/serv</w:t>
-      </w:r>
-      <w:r>
-        <w:rPr>
-          <w:color w:val="1A1A1A"/>
-        </w:rPr>
-        <w:t>ices/data-analytics). Your people need to run what we build: see Corporate AI Training (/</w:t>
+        <w:t xml:space="preserve"> Building the data platform, pipelines or governance controls? See Data Analytics &amp; Engineering (/services/data-analytics). Your people need to run what we build: see Corporate AI Training (/</w:t>
       </w:r>
       <w:proofErr w:type="spellStart"/>
       <w:r>
@@ -3363,13 +3188,7 @@
         <w:rPr>
           <w:color w:val="1A1A1A"/>
         </w:rPr>
-        <w:t>A strategy is only useful if it turns into something real. Once the p</w:t>
-      </w:r>
-      <w:r>
-        <w:rPr>
-          <w:color w:val="1A1A1A"/>
-        </w:rPr>
-        <w:t>riorities are set, our data and applied AI teams build what your roadmap calls for.</w:t>
+        <w:t>A strategy is only useful if it turns into something real. Once the priorities are set, our data and applied AI teams build what your roadmap calls for.</w:t>
       </w:r>
     </w:p>
     <w:p>
@@ -3951,16 +3770,7 @@
                 <w:sz w:val="19"/>
                 <w:szCs w:val="19"/>
               </w:rPr>
-              <w:t>/services/computer-vis</w:t>
-            </w:r>
-            <w:r>
-              <w:rPr>
-                <w:rFonts w:ascii="Consolas" w:eastAsia="Consolas" w:hAnsi="Consolas" w:cs="Consolas"/>
-                <w:color w:val="1A1A1A"/>
-                <w:sz w:val="19"/>
-                <w:szCs w:val="19"/>
-              </w:rPr>
-              <w:t>ion</w:t>
+              <w:t>/services/computer-vision</w:t>
             </w:r>
           </w:p>
         </w:tc>
@@ -4664,23 +4474,7 @@
                 <w:sz w:val="19"/>
                 <w:szCs w:val="19"/>
               </w:rPr>
-              <w:t>A pilot built for production on the first use case, us</w:t>
-            </w:r>
-            <w:r>
-              <w:rPr>
-                <w:color w:val="1A1A1A"/>
-                <w:sz w:val="19"/>
-                <w:szCs w:val="19"/>
-              </w:rPr>
-              <w:t>ually six to twelve weeks</w:t>
-            </w:r>
-            <w:r>
-              <w:rPr>
-                <w:color w:val="1A1A1A"/>
-                <w:sz w:val="19"/>
-                <w:szCs w:val="19"/>
-              </w:rPr>
-              <w:t>, then a phased rollout based on results</w:t>
+              <w:t>A pilot built for production on the first use case, usually six to twelve weeks, then a phased rollout based on results</w:t>
             </w:r>
           </w:p>
         </w:tc>
@@ -4968,7 +4762,7 @@
                 <w:sz w:val="17"/>
                 <w:szCs w:val="17"/>
               </w:rPr>
-              <w:t>Investors and advisers had to read fund reports of 40+ pages to compare funds and judge risk</w:t>
+              <w:t>Investors needed guidance on fund selection, portfolio performance and their accounts, and had to go through support or long fund reports to get it</w:t>
             </w:r>
           </w:p>
         </w:tc>
@@ -4990,12 +4784,7 @@
           </w:tcPr>
           <w:p>
             <w:r>
-              <w:rPr>
-                <w:color w:val="1A1A1A"/>
-                <w:sz w:val="17"/>
-                <w:szCs w:val="17"/>
-              </w:rPr>
-              <w:t>Built an LLM powered investment assistant that profiles risk in plain language, suggests suitable funds and compares performance</w:t>
+              <w:t>Built an AI assistant into their platform that answers investor questions and recommends suitable funds in natural conversation</w:t>
             </w:r>
           </w:p>
         </w:tc>
@@ -5017,36 +4806,7 @@
           </w:tcPr>
           <w:p>
             <w:r>
-              <w:rPr>
-                <w:color w:val="1A1A1A"/>
-                <w:sz w:val="17"/>
-                <w:szCs w:val="17"/>
-              </w:rPr>
-              <w:t>F</w:t>
-            </w:r>
-            <w:r>
-              <w:rPr>
-                <w:color w:val="1A1A1A"/>
-                <w:sz w:val="17"/>
-                <w:szCs w:val="17"/>
-              </w:rPr>
-              <w:t>i</w:t>
-            </w:r>
-            <w:r>
-              <w:rPr>
-                <w:color w:val="1A1A1A"/>
-                <w:sz w:val="17"/>
-                <w:szCs w:val="17"/>
-              </w:rPr>
-              <w:t>nd research through a conversati</w:t>
-            </w:r>
-            <w:r>
-              <w:rPr>
-                <w:color w:val="1A1A1A"/>
-                <w:sz w:val="17"/>
-                <w:szCs w:val="17"/>
-              </w:rPr>
-              <w:t>onal assistant, available at any hour</w:t>
+              <w:t>Investors get fund guidance and portfolio answers instantly, without a support queue</w:t>
             </w:r>
           </w:p>
         </w:tc>
@@ -5078,7 +4838,7 @@
                 <w:sz w:val="17"/>
                 <w:szCs w:val="17"/>
               </w:rPr>
-              <w:t xml:space="preserve">One of the largest </w:t>
+              <w:t>A leading</w:t>
             </w:r>
             <w:r>
               <w:rPr>
@@ -5086,7 +4846,7 @@
                 <w:sz w:val="17"/>
                 <w:szCs w:val="17"/>
               </w:rPr>
-              <w:t>South African retailer</w:t>
+              <w:t xml:space="preserve"> </w:t>
             </w:r>
             <w:r>
               <w:rPr>
@@ -5094,7 +4854,15 @@
                 <w:sz w:val="17"/>
                 <w:szCs w:val="17"/>
               </w:rPr>
-              <w:t>s</w:t>
+              <w:t>South African retaile</w:t>
+            </w:r>
+            <w:r>
+              <w:rPr>
+                <w:color w:val="1A1A1A"/>
+                <w:sz w:val="17"/>
+                <w:szCs w:val="17"/>
+              </w:rPr>
+              <w:t>r</w:t>
             </w:r>
           </w:p>
         </w:tc>
@@ -5235,6 +5003,14 @@
               </w:rPr>
               <w:t xml:space="preserve"> based in </w:t>
             </w:r>
+            <w:r>
+              <w:rPr>
+                <w:color w:val="1A1A1A"/>
+                <w:sz w:val="17"/>
+                <w:szCs w:val="17"/>
+              </w:rPr>
+              <w:t>USA</w:t>
+            </w:r>
           </w:p>
         </w:tc>
         <w:tc>
@@ -5418,15 +5194,7 @@
                 <w:sz w:val="17"/>
                 <w:szCs w:val="17"/>
               </w:rPr>
-              <w:t>Built a transc</w:t>
-            </w:r>
-            <w:r>
-              <w:rPr>
-                <w:color w:val="1A1A1A"/>
-                <w:sz w:val="17"/>
-                <w:szCs w:val="17"/>
-              </w:rPr>
-              <w:t xml:space="preserve">ription engine and a RAG search over an LLM, with a </w:t>
+              <w:t xml:space="preserve">Built a transcription engine and a RAG search over an LLM, with a </w:t>
             </w:r>
             <w:r>
               <w:rPr>
@@ -5509,7 +5277,7 @@
                 <w:sz w:val="17"/>
                 <w:szCs w:val="17"/>
               </w:rPr>
-              <w:t xml:space="preserve">leading </w:t>
+              <w:t>popular</w:t>
             </w:r>
             <w:r>
               <w:rPr>
@@ -5517,56 +5285,66 @@
                 <w:sz w:val="17"/>
                 <w:szCs w:val="17"/>
               </w:rPr>
-              <w:t>Saudi Arabian fast food chain</w:t>
-            </w:r>
-          </w:p>
-        </w:tc>
-        <w:tc>
-          <w:tcPr>
-            <w:tcW w:w="2620" w:type="dxa"/>
-            <w:tcBorders>
-              <w:top w:val="single" w:sz="4" w:space="0" w:color="D1D5DB"/>
-              <w:left w:val="single" w:sz="4" w:space="0" w:color="D1D5DB"/>
-              <w:bottom w:val="single" w:sz="4" w:space="0" w:color="D1D5DB"/>
-              <w:right w:val="single" w:sz="4" w:space="0" w:color="D1D5DB"/>
-            </w:tcBorders>
-            <w:tcMar>
-              <w:top w:w="70" w:type="dxa"/>
-              <w:left w:w="110" w:type="dxa"/>
-              <w:bottom w:w="70" w:type="dxa"/>
-              <w:right w:w="110" w:type="dxa"/>
-            </w:tcMar>
-          </w:tcPr>
-          <w:p>
-            <w:r>
-              <w:t>High order volumes at peak hours</w:t>
-            </w:r>
-          </w:p>
-        </w:tc>
-        <w:tc>
-          <w:tcPr>
-            <w:tcW w:w="2620" w:type="dxa"/>
-            <w:tcBorders>
-              <w:top w:val="single" w:sz="4" w:space="0" w:color="D1D5DB"/>
-              <w:left w:val="single" w:sz="4" w:space="0" w:color="D1D5DB"/>
-              <w:bottom w:val="single" w:sz="4" w:space="0" w:color="D1D5DB"/>
-              <w:right w:val="single" w:sz="4" w:space="0" w:color="D1D5DB"/>
-            </w:tcBorders>
-            <w:tcMar>
-              <w:top w:w="70" w:type="dxa"/>
-              <w:left w:w="110" w:type="dxa"/>
-              <w:bottom w:w="70" w:type="dxa"/>
-              <w:right w:w="110" w:type="dxa"/>
-            </w:tcMar>
-          </w:tcPr>
-          <w:p>
+              <w:t xml:space="preserve"> </w:t>
+            </w:r>
             <w:r>
               <w:rPr>
                 <w:color w:val="1A1A1A"/>
                 <w:sz w:val="17"/>
                 <w:szCs w:val="17"/>
               </w:rPr>
-              <w:t>Created</w:t>
+              <w:t>Saudi Arabian fast food chain</w:t>
+            </w:r>
+            <w:bookmarkStart w:id="0" w:name="_GoBack"/>
+            <w:bookmarkEnd w:id="0"/>
+          </w:p>
+        </w:tc>
+        <w:tc>
+          <w:tcPr>
+            <w:tcW w:w="2620" w:type="dxa"/>
+            <w:tcBorders>
+              <w:top w:val="single" w:sz="4" w:space="0" w:color="D1D5DB"/>
+              <w:left w:val="single" w:sz="4" w:space="0" w:color="D1D5DB"/>
+              <w:bottom w:val="single" w:sz="4" w:space="0" w:color="D1D5DB"/>
+              <w:right w:val="single" w:sz="4" w:space="0" w:color="D1D5DB"/>
+            </w:tcBorders>
+            <w:tcMar>
+              <w:top w:w="70" w:type="dxa"/>
+              <w:left w:w="110" w:type="dxa"/>
+              <w:bottom w:w="70" w:type="dxa"/>
+              <w:right w:w="110" w:type="dxa"/>
+            </w:tcMar>
+          </w:tcPr>
+          <w:p>
+            <w:r>
+              <w:t>High order volumes at peak hours</w:t>
+            </w:r>
+          </w:p>
+        </w:tc>
+        <w:tc>
+          <w:tcPr>
+            <w:tcW w:w="2620" w:type="dxa"/>
+            <w:tcBorders>
+              <w:top w:val="single" w:sz="4" w:space="0" w:color="D1D5DB"/>
+              <w:left w:val="single" w:sz="4" w:space="0" w:color="D1D5DB"/>
+              <w:bottom w:val="single" w:sz="4" w:space="0" w:color="D1D5DB"/>
+              <w:right w:val="single" w:sz="4" w:space="0" w:color="D1D5DB"/>
+            </w:tcBorders>
+            <w:tcMar>
+              <w:top w:w="70" w:type="dxa"/>
+              <w:left w:w="110" w:type="dxa"/>
+              <w:bottom w:w="70" w:type="dxa"/>
+              <w:right w:w="110" w:type="dxa"/>
+            </w:tcMar>
+          </w:tcPr>
+          <w:p>
+            <w:r>
+              <w:rPr>
+                <w:color w:val="1A1A1A"/>
+                <w:sz w:val="17"/>
+                <w:szCs w:val="17"/>
+              </w:rPr>
+              <w:t>Deployed</w:t>
             </w:r>
             <w:r>
               <w:rPr>
@@ -5688,8 +5466,140 @@
           <w:sz w:val="18"/>
           <w:szCs w:val="18"/>
         </w:rPr>
-        <w:t>. The tw</w:t>
-      </w:r>
+        <w:t>. The two data cards use the same wording as the Data Analytics page, so the pages agree.</w:t>
+      </w:r>
+    </w:p>
+    <w:p>
+      <w:pPr>
+        <w:spacing w:after="130" w:line="300" w:lineRule="auto"/>
+      </w:pPr>
+      <w:r>
+        <w:rPr>
+          <w:b/>
+          <w:bCs/>
+          <w:color w:val="1A1A1A"/>
+        </w:rPr>
+        <w:t>H3:</w:t>
+      </w:r>
+      <w:r>
+        <w:rPr>
+          <w:color w:val="1A1A1A"/>
+        </w:rPr>
+        <w:t xml:space="preserve"> How We Build AI Agents</w:t>
+      </w:r>
+    </w:p>
+    <w:p>
+      <w:pPr>
+        <w:spacing w:after="130" w:line="300" w:lineRule="auto"/>
+      </w:pPr>
+      <w:r>
+        <w:rPr>
+          <w:color w:val="1A1A1A"/>
+        </w:rPr>
+        <w:lastRenderedPageBreak/>
+        <w:t>Our multi agent reference architecture covers 11 stages, from intake and planning to tool use, memory, evaluation and monitoring</w:t>
+      </w:r>
+      <w:r>
+        <w:rPr>
+          <w:color w:val="1A1A1A"/>
+        </w:rPr>
+        <w:t xml:space="preserve">. </w:t>
+      </w:r>
+      <w:r>
+        <w:rPr>
+          <w:color w:val="1A1A1A"/>
+        </w:rPr>
+        <w:t xml:space="preserve">We build on </w:t>
+      </w:r>
+      <w:proofErr w:type="spellStart"/>
+      <w:r>
+        <w:rPr>
+          <w:color w:val="1A1A1A"/>
+        </w:rPr>
+        <w:t>LangChain</w:t>
+      </w:r>
+      <w:proofErr w:type="spellEnd"/>
+      <w:r>
+        <w:rPr>
+          <w:color w:val="1A1A1A"/>
+        </w:rPr>
+        <w:t xml:space="preserve">, </w:t>
+      </w:r>
+      <w:proofErr w:type="spellStart"/>
+      <w:r>
+        <w:rPr>
+          <w:color w:val="1A1A1A"/>
+        </w:rPr>
+        <w:t>LangGraph</w:t>
+      </w:r>
+      <w:proofErr w:type="spellEnd"/>
+      <w:r>
+        <w:rPr>
+          <w:color w:val="1A1A1A"/>
+        </w:rPr>
+        <w:t xml:space="preserve">, </w:t>
+      </w:r>
+      <w:proofErr w:type="spellStart"/>
+      <w:r>
+        <w:rPr>
+          <w:color w:val="1A1A1A"/>
+        </w:rPr>
+        <w:t>AutoGen</w:t>
+      </w:r>
+      <w:proofErr w:type="spellEnd"/>
+      <w:r>
+        <w:rPr>
+          <w:color w:val="1A1A1A"/>
+        </w:rPr>
+        <w:t xml:space="preserve">, </w:t>
+      </w:r>
+      <w:proofErr w:type="spellStart"/>
+      <w:r>
+        <w:rPr>
+          <w:color w:val="1A1A1A"/>
+        </w:rPr>
+        <w:t>CrewAI</w:t>
+      </w:r>
+      <w:proofErr w:type="spellEnd"/>
+      <w:r>
+        <w:rPr>
+          <w:color w:val="1A1A1A"/>
+        </w:rPr>
+        <w:t xml:space="preserve">, </w:t>
+      </w:r>
+      <w:proofErr w:type="spellStart"/>
+      <w:r>
+        <w:rPr>
+          <w:color w:val="1A1A1A"/>
+        </w:rPr>
+        <w:t>OpenAI</w:t>
+      </w:r>
+      <w:proofErr w:type="spellEnd"/>
+      <w:r>
+        <w:rPr>
+          <w:color w:val="1A1A1A"/>
+        </w:rPr>
+        <w:t xml:space="preserve">, Anthropic, Pinecone, Chroma, </w:t>
+      </w:r>
+      <w:proofErr w:type="spellStart"/>
+      <w:r>
+        <w:rPr>
+          <w:color w:val="1A1A1A"/>
+        </w:rPr>
+        <w:t>FastAPI</w:t>
+      </w:r>
+      <w:proofErr w:type="spellEnd"/>
+      <w:r>
+        <w:rPr>
+          <w:color w:val="1A1A1A"/>
+        </w:rPr>
+        <w:t xml:space="preserve"> and Kubernetes, and choose the stack per use case.</w:t>
+      </w:r>
+    </w:p>
+    <w:p>
+      <w:pPr>
+        <w:spacing w:after="120"/>
+      </w:pPr>
       <w:r>
         <w:rPr>
           <w:i/>
@@ -5698,197 +5608,6 @@
           <w:sz w:val="18"/>
           <w:szCs w:val="18"/>
         </w:rPr>
-        <w:t>o data cards use the same wording as the Data Analytics page, so the pages agree.</w:t>
-      </w:r>
-    </w:p>
-    <w:p>
-      <w:pPr>
-        <w:spacing w:after="120"/>
-      </w:pPr>
-      <w:r>
-        <w:rPr>
-          <w:i/>
-          <w:iCs/>
-          <w:color w:val="6B7280"/>
-          <w:sz w:val="18"/>
-          <w:szCs w:val="18"/>
-        </w:rPr>
-        <w:t xml:space="preserve">If the </w:t>
-      </w:r>
-      <w:proofErr w:type="spellStart"/>
-      <w:r>
-        <w:rPr>
-          <w:i/>
-          <w:iCs/>
-          <w:color w:val="6B7280"/>
-          <w:sz w:val="18"/>
-          <w:szCs w:val="18"/>
-        </w:rPr>
-        <w:t>xServe</w:t>
-      </w:r>
-      <w:proofErr w:type="spellEnd"/>
-      <w:r>
-        <w:rPr>
-          <w:i/>
-          <w:iCs/>
-          <w:color w:val="6B7280"/>
-          <w:sz w:val="18"/>
-          <w:szCs w:val="18"/>
-        </w:rPr>
-        <w:t xml:space="preserve"> details aren't confirmed before launch, drop the card. Four cards are enough.</w:t>
-      </w:r>
-    </w:p>
-    <w:p>
-      <w:pPr>
-        <w:spacing w:after="130" w:line="300" w:lineRule="auto"/>
-      </w:pPr>
-      <w:r>
-        <w:rPr>
-          <w:b/>
-          <w:bCs/>
-          <w:color w:val="1A1A1A"/>
-        </w:rPr>
-        <w:t>H3:</w:t>
-      </w:r>
-      <w:r>
-        <w:rPr>
-          <w:color w:val="1A1A1A"/>
-        </w:rPr>
-        <w:t xml:space="preserve"> How We Build AI Agents</w:t>
-      </w:r>
-    </w:p>
-    <w:p>
-      <w:pPr>
-        <w:spacing w:after="130" w:line="300" w:lineRule="auto"/>
-      </w:pPr>
-      <w:r>
-        <w:rPr>
-          <w:color w:val="1A1A1A"/>
-        </w:rPr>
-        <w:lastRenderedPageBreak/>
-        <w:t>Our multi agent reference architecture covers 11 stages</w:t>
-      </w:r>
-      <w:r>
-        <w:rPr>
-          <w:color w:val="1A1A1A"/>
-        </w:rPr>
-        <w:t>, from intake and planning to tool use, memory, evaluation and monitoring</w:t>
-      </w:r>
-      <w:r>
-        <w:rPr>
-          <w:color w:val="1A1A1A"/>
-        </w:rPr>
-        <w:t xml:space="preserve">. </w:t>
-      </w:r>
-      <w:r>
-        <w:rPr>
-          <w:color w:val="1A1A1A"/>
-        </w:rPr>
-        <w:t xml:space="preserve">We build on </w:t>
-      </w:r>
-      <w:proofErr w:type="spellStart"/>
-      <w:r>
-        <w:rPr>
-          <w:color w:val="1A1A1A"/>
-        </w:rPr>
-        <w:t>LangChain</w:t>
-      </w:r>
-      <w:proofErr w:type="spellEnd"/>
-      <w:r>
-        <w:rPr>
-          <w:color w:val="1A1A1A"/>
-        </w:rPr>
-        <w:t xml:space="preserve">, </w:t>
-      </w:r>
-      <w:proofErr w:type="spellStart"/>
-      <w:r>
-        <w:rPr>
-          <w:color w:val="1A1A1A"/>
-        </w:rPr>
-        <w:t>LangGraph</w:t>
-      </w:r>
-      <w:proofErr w:type="spellEnd"/>
-      <w:r>
-        <w:rPr>
-          <w:color w:val="1A1A1A"/>
-        </w:rPr>
-        <w:t xml:space="preserve">, </w:t>
-      </w:r>
-      <w:proofErr w:type="spellStart"/>
-      <w:r>
-        <w:rPr>
-          <w:color w:val="1A1A1A"/>
-        </w:rPr>
-        <w:t>AutoGen</w:t>
-      </w:r>
-      <w:proofErr w:type="spellEnd"/>
-      <w:r>
-        <w:rPr>
-          <w:color w:val="1A1A1A"/>
-        </w:rPr>
-        <w:t xml:space="preserve">, </w:t>
-      </w:r>
-      <w:proofErr w:type="spellStart"/>
-      <w:r>
-        <w:rPr>
-          <w:color w:val="1A1A1A"/>
-        </w:rPr>
-        <w:t>CrewAI</w:t>
-      </w:r>
-      <w:proofErr w:type="spellEnd"/>
-      <w:r>
-        <w:rPr>
-          <w:color w:val="1A1A1A"/>
-        </w:rPr>
-        <w:t xml:space="preserve">, </w:t>
-      </w:r>
-      <w:proofErr w:type="spellStart"/>
-      <w:r>
-        <w:rPr>
-          <w:color w:val="1A1A1A"/>
-        </w:rPr>
-        <w:t>OpenAI</w:t>
-      </w:r>
-      <w:proofErr w:type="spellEnd"/>
-      <w:r>
-        <w:rPr>
-          <w:color w:val="1A1A1A"/>
-        </w:rPr>
-        <w:t xml:space="preserve">, Anthropic, Pinecone, Chroma, </w:t>
-      </w:r>
-      <w:proofErr w:type="spellStart"/>
-      <w:r>
-        <w:rPr>
-          <w:color w:val="1A1A1A"/>
-        </w:rPr>
-        <w:t>FastAPI</w:t>
-      </w:r>
-      <w:proofErr w:type="spellEnd"/>
-      <w:r>
-        <w:rPr>
-          <w:color w:val="1A1A1A"/>
-        </w:rPr>
-        <w:t xml:space="preserve"> and Kubernetes, and choose the stack pe</w:t>
-      </w:r>
-      <w:r>
-        <w:rPr>
-          <w:color w:val="1A1A1A"/>
-        </w:rPr>
-        <w:t>r use case.</w:t>
-      </w:r>
-    </w:p>
-    <w:p>
-      <w:pPr>
-        <w:spacing w:after="120"/>
-      </w:pPr>
-      <w:r>
-        <w:rPr>
-          <w:i/>
-          <w:iCs/>
-          <w:color w:val="6B7280"/>
-          <w:sz w:val="18"/>
-          <w:szCs w:val="18"/>
-        </w:rPr>
         <w:t>Design: a simple 11 step strip. Text, not an image, so search and AI agents can read it.</w:t>
       </w:r>
     </w:p>
@@ -5963,15 +5682,7 @@
           <w:bCs/>
           <w:color w:val="1A1A1A"/>
         </w:rPr>
-        <w:t>Ser</w:t>
-      </w:r>
-      <w:r>
-        <w:rPr>
-          <w:b/>
-          <w:bCs/>
-          <w:color w:val="1A1A1A"/>
-        </w:rPr>
-        <w:t>efin</w:t>
+        <w:t>Serefin</w:t>
       </w:r>
       <w:proofErr w:type="spellEnd"/>
       <w:r>
@@ -6215,15 +5926,7 @@
                 <w:sz w:val="19"/>
                 <w:szCs w:val="19"/>
               </w:rPr>
-              <w:t>Pressure from the board to act on AI · pilots that never reached production · too many use cases and no way to choos</w:t>
-            </w:r>
-            <w:r>
-              <w:rPr>
-                <w:color w:val="1A1A1A"/>
-                <w:sz w:val="19"/>
-                <w:szCs w:val="19"/>
-              </w:rPr>
-              <w:t>e · data not ready · security or compliance can't sign off</w:t>
+              <w:t>Pressure from the board to act on AI · pilots that never reached production · too many use cases and no way to choose · data not ready · security or compliance can't sign off</w:t>
             </w:r>
           </w:p>
         </w:tc>
@@ -6410,15 +6113,7 @@
                 <w:sz w:val="19"/>
                 <w:szCs w:val="19"/>
               </w:rPr>
-              <w:t>LLM investment assistant · Snowflake single source of truth for AI use cases · Snow</w:t>
-            </w:r>
-            <w:r>
-              <w:rPr>
-                <w:color w:val="1A1A1A"/>
-                <w:sz w:val="19"/>
-                <w:szCs w:val="19"/>
-              </w:rPr>
-              <w:t xml:space="preserve">flake platform design · RAG search over a video archive · </w:t>
+              <w:t xml:space="preserve">LLM investment assistant · Snowflake single source of truth for AI use cases · Snowflake platform design · RAG search over a video archive · </w:t>
             </w:r>
             <w:proofErr w:type="spellStart"/>
             <w:r>
@@ -6858,13 +6553,7 @@
         <w:rPr>
           <w:color w:val="1A1A1A"/>
         </w:rPr>
-        <w:t>A d</w:t>
-      </w:r>
-      <w:r>
-        <w:rPr>
-          <w:color w:val="1A1A1A"/>
-        </w:rPr>
-        <w:t xml:space="preserve">ata and AI consultant </w:t>
+        <w:t xml:space="preserve">A data and AI consultant </w:t>
       </w:r>
       <w:proofErr w:type="gramStart"/>
       <w:r>
@@ -6878,13 +6567,7 @@
         <w:rPr>
           <w:color w:val="1A1A1A"/>
         </w:rPr>
-        <w:t xml:space="preserve"> you decide where AI will pay off and what your data needs to support it. That means assessing your data and systems, choosing the use cases worth funding, building the business case and roadmap, and setting up governance. Good c</w:t>
-      </w:r>
-      <w:r>
-        <w:rPr>
-          <w:color w:val="1A1A1A"/>
-        </w:rPr>
-        <w:t>onsultants also plan how the pilot reaches production.</w:t>
+        <w:t xml:space="preserve"> you decide where AI will pay off and what your data needs to support it. That means assessing your data and systems, choosing the use cases worth funding, building the business case and roadmap, and setting up governance. Good consultants also plan how the pilot reaches production.</w:t>
       </w:r>
     </w:p>
     <w:p>
@@ -6909,13 +6592,7 @@
           <w:color w:val="1A1A1A"/>
         </w:rPr>
         <w:lastRenderedPageBreak/>
-        <w:t>Not a separate one first. Plan them together. Each priority AI use case shows which data matters, so the data strategy fixes that data first instead of</w:t>
-      </w:r>
-      <w:r>
-        <w:rPr>
-          <w:color w:val="1A1A1A"/>
-        </w:rPr>
-        <w:t xml:space="preserve"> trying to fix everything. Where the data isn't ready, the roadmap puts the foundation work ahead of the build.</w:t>
+        <w:t>Not a separate one first. Plan them together. Each priority AI use case shows which data matters, so the data strategy fixes that data first instead of trying to fix everything. Where the data isn't ready, the roadmap puts the foundation work ahead of the build.</w:t>
       </w:r>
     </w:p>
     <w:p>
@@ -6939,13 +6616,7 @@
         <w:rPr>
           <w:color w:val="1A1A1A"/>
         </w:rPr>
-        <w:t>We score every candidate on business value, feasibility, data availability and risk. The first use case should be valuable enough to matter and simple enough to prove the approach. Use cases that need major data work usually come later, once the foundation</w:t>
-      </w:r>
-      <w:r>
-        <w:rPr>
-          <w:color w:val="1A1A1A"/>
-        </w:rPr>
-        <w:t xml:space="preserve"> is in place.</w:t>
+        <w:t>We score every candidate on business value, feasibility, data availability and risk. The first use case should be valuable enough to matter and simple enough to prove the approach. Use cases that need major data work usually come later, once the foundation is in place.</w:t>
       </w:r>
     </w:p>
     <w:p>
@@ -6983,13 +6654,7 @@
         <w:rPr>
           <w:color w:val="1A1A1A"/>
         </w:rPr>
-        <w:t xml:space="preserve"> two to four weeks. A first pilot usually takes six to twelve weeks, followed by a phased rollout based on results. We set the timeline for your own scope </w:t>
-      </w:r>
-      <w:r>
-        <w:rPr>
-          <w:color w:val="1A1A1A"/>
-        </w:rPr>
-        <w:t>during the assessment</w:t>
+        <w:t xml:space="preserve"> two to four weeks. A first pilot usually takes six to twelve weeks, followed by a phased rollout based on results. We set the timeline for your own scope during the assessment</w:t>
       </w:r>
       <w:r>
         <w:rPr>
@@ -7019,13 +6684,7 @@
         <w:rPr>
           <w:color w:val="1A1A1A"/>
         </w:rPr>
-        <w:t>It depends on the use case. Most need relevant historical data, access to the systems it lives in, and a named owner who understands it. Gap</w:t>
-      </w:r>
-      <w:r>
-        <w:rPr>
-          <w:color w:val="1A1A1A"/>
-        </w:rPr>
-        <w:t>s are normal at the start. Finding them is part of the assessment, before any build begins.</w:t>
+        <w:t>It depends on the use case. Most need relevant historical data, access to the systems it lives in, and a named owner who understands it. Gaps are normal at the start. Finding them is part of the assessment, before any build begins.</w:t>
       </w:r>
     </w:p>
     <w:p>
@@ -7049,13 +6708,7 @@
         <w:rPr>
           <w:color w:val="1A1A1A"/>
         </w:rPr>
-        <w:t>Usually for one of three reasons: the data isn't ready, the pilot was built for a demo rather than for production</w:t>
-      </w:r>
-      <w:r>
-        <w:rPr>
-          <w:color w:val="1A1A1A"/>
-        </w:rPr>
-        <w:t>, or nobody can show that it is safe. Each needs a different fix, which is why we check all three before a build starts.</w:t>
+        <w:t>Usually for one of three reasons: the data isn't ready, the pilot was built for a demo rather than for production, or nobody can show that it is safe. Each needs a different fix, which is why we check all three before a build starts.</w:t>
       </w:r>
     </w:p>
     <w:p>
@@ -7079,13 +6732,7 @@
         <w:rPr>
           <w:color w:val="1A1A1A"/>
         </w:rPr>
-        <w:t>We set data ownership, quality standards and access rules, an AI use policy, a risk ass</w:t>
-      </w:r>
-      <w:r>
-        <w:rPr>
-          <w:color w:val="1A1A1A"/>
-        </w:rPr>
-        <w:t>essment for each use case, and clear accountability for every model. Our team includes certified ISO 42001 and ISO 27001 Lead Auditors, and we plan security testing before launch with our AI Security (/services/ai-security-service) team.</w:t>
+        <w:t>We set data ownership, quality standards and access rules, an AI use policy, a risk assessment for each use case, and clear accountability for every model. Our team includes certified ISO 42001 and ISO 27001 Lead Auditors, and we plan security testing before launch with our AI Security (/services/ai-security-service) team.</w:t>
       </w:r>
     </w:p>
     <w:p>
@@ -7098,33 +6745,63 @@
           <w:bCs/>
           <w:color w:val="1A1A1A"/>
         </w:rPr>
-        <w:t>What is the differ</w:t>
-      </w:r>
+        <w:t xml:space="preserve">What is the difference between AI consulting and </w:t>
+      </w:r>
+      <w:proofErr w:type="spellStart"/>
       <w:r>
         <w:rPr>
           <w:b/>
           <w:bCs/>
           <w:color w:val="1A1A1A"/>
         </w:rPr>
-        <w:t xml:space="preserve">ence between AI consulting and </w:t>
-      </w:r>
-      <w:proofErr w:type="spellStart"/>
+        <w:t>LLMOps</w:t>
+      </w:r>
+      <w:proofErr w:type="spellEnd"/>
       <w:r>
         <w:rPr>
           <w:b/>
           <w:bCs/>
           <w:color w:val="1A1A1A"/>
         </w:rPr>
+        <w:t xml:space="preserve"> consulting?</w:t>
+      </w:r>
+    </w:p>
+    <w:p>
+      <w:pPr>
+        <w:spacing w:after="130" w:line="300" w:lineRule="auto"/>
+      </w:pPr>
+      <w:r>
+        <w:rPr>
+          <w:color w:val="1A1A1A"/>
+        </w:rPr>
+        <w:t xml:space="preserve">AI consulting decides what to build and why: readiness, use cases, the business case and the roadmap. </w:t>
+      </w:r>
+      <w:proofErr w:type="spellStart"/>
+      <w:r>
+        <w:rPr>
+          <w:color w:val="1A1A1A"/>
+        </w:rPr>
         <w:t>LLMOps</w:t>
       </w:r>
       <w:proofErr w:type="spellEnd"/>
+      <w:r>
+        <w:rPr>
+          <w:color w:val="1A1A1A"/>
+        </w:rPr>
+        <w:t xml:space="preserve"> covers how large language models run in production: deployment, monitoring, evaluation, cost and updates. We offer both, often as phases of the same engagement.</w:t>
+      </w:r>
+    </w:p>
+    <w:p>
+      <w:pPr>
+        <w:spacing w:after="130" w:line="300" w:lineRule="auto"/>
+      </w:pPr>
       <w:r>
         <w:rPr>
           <w:b/>
           <w:bCs/>
           <w:color w:val="1A1A1A"/>
         </w:rPr>
-        <w:t xml:space="preserve"> consulting?</w:t>
+        <w:t>Do you build the AI solution as well, or only advise?</w:t>
       </w:r>
     </w:p>
     <w:p>
@@ -7135,57 +6812,7 @@
         <w:rPr>
           <w:color w:val="1A1A1A"/>
         </w:rPr>
-        <w:t xml:space="preserve">AI consulting decides what to build and why: readiness, use cases, the business case and the roadmap. </w:t>
-      </w:r>
-      <w:proofErr w:type="spellStart"/>
-      <w:r>
-        <w:rPr>
-          <w:color w:val="1A1A1A"/>
-        </w:rPr>
-        <w:t>LLMOps</w:t>
-      </w:r>
-      <w:proofErr w:type="spellEnd"/>
-      <w:r>
-        <w:rPr>
-          <w:color w:val="1A1A1A"/>
-        </w:rPr>
-        <w:t xml:space="preserve"> covers how large language models run in production: deployment, monitoring, evaluation, cost and </w:t>
-      </w:r>
-      <w:r>
-        <w:rPr>
-          <w:color w:val="1A1A1A"/>
-        </w:rPr>
-        <w:t>updates. We offer both, often as phases of the same engagement.</w:t>
-      </w:r>
-    </w:p>
-    <w:p>
-      <w:pPr>
-        <w:spacing w:after="130" w:line="300" w:lineRule="auto"/>
-      </w:pPr>
-      <w:r>
-        <w:rPr>
-          <w:b/>
-          <w:bCs/>
-          <w:color w:val="1A1A1A"/>
-        </w:rPr>
-        <w:t>Do you build the AI solution as well, or only advise?</w:t>
-      </w:r>
-    </w:p>
-    <w:p>
-      <w:pPr>
-        <w:spacing w:after="130" w:line="300" w:lineRule="auto"/>
-      </w:pPr>
-      <w:r>
-        <w:rPr>
-          <w:color w:val="1A1A1A"/>
-        </w:rPr>
-        <w:t>Both. The same firm that writes the roadmap can build it: the data platform through Data Analytics &amp; Engineering (/services/data-analytics), and the models and agents through Applied AI Solutions (/services/applied-ai-solutions). We can also train your peo</w:t>
-      </w:r>
-      <w:r>
-        <w:rPr>
-          <w:color w:val="1A1A1A"/>
-        </w:rPr>
-        <w:t>ple to run it. You can also take the roadmap to another team or build it yourselves.</w:t>
+        <w:t>Both. The same firm that writes the roadmap can build it: the data platform through Data Analytics &amp; Engineering (/services/data-analytics), and the models and agents through Applied AI Solutions (/services/applied-ai-solutions). We can also train your people to run it. You can also take the roadmap to another team or build it yourselves.</w:t>
       </w:r>
     </w:p>
     <w:p>
@@ -7252,13 +6879,7 @@
         <w:rPr>
           <w:color w:val="1A1A1A"/>
         </w:rPr>
-        <w:t xml:space="preserve"> we'll look at what you want AI to do, what your data can support today, and the first use case wort</w:t>
-      </w:r>
-      <w:r>
-        <w:rPr>
-          <w:color w:val="1A1A1A"/>
-        </w:rPr>
-        <w:t>h testing. You'll leave with a clear next step, whether or not it involves us.</w:t>
+        <w:t xml:space="preserve"> we'll look at what you want AI to do, what your data can support today, and the first use case worth testing. You'll leave with a clear next step, whether or not it involves us.</w:t>
       </w:r>
     </w:p>
     <w:p>
@@ -7297,13 +6918,7 @@
         <w:rPr>
           <w:color w:val="1A1A1A"/>
         </w:rPr>
-        <w:t xml:space="preserve"> Name · Work email · Company · Company size (Under 50 · 50 to 499 · 500 to 999 · 1,000+) · Role · What do you want</w:t>
-      </w:r>
-      <w:r>
-        <w:rPr>
-          <w:color w:val="1A1A1A"/>
-        </w:rPr>
-        <w:t xml:space="preserve"> data and AI to do for the business? (one line)</w:t>
+        <w:t xml:space="preserve"> Name · Work email · Company · Company size (Under 50 · 50 to 499 · 500 to 999 · 1,000+) · Role · What do you want data and AI to do for the business? (one line)</w:t>
       </w:r>
     </w:p>
     <w:p>
@@ -7350,13 +6965,7 @@
         <w:rPr>
           <w:color w:val="1A1A1A"/>
         </w:rPr>
-        <w:t xml:space="preserve"> Why Data Quality Is the Real Backbone of AI Success · Why Most Enterprise AI Proje</w:t>
-      </w:r>
-      <w:r>
-        <w:rPr>
-          <w:color w:val="1A1A1A"/>
-        </w:rPr>
-        <w:t>cts Stall After the Pilot · The 6 Must-Know AI Frameworks for CIOs · Choosing Between Off-the-Shelf &amp; Custom AI Solutions</w:t>
+        <w:t xml:space="preserve"> Why Data Quality Is the Real Backbone of AI Success · Why Most Enterprise AI Projects Stall After the Pilot · The 6 Must-Know AI Frameworks for CIOs · Choosing Between Off-the-Shelf &amp; Custom AI Solutions</w:t>
       </w:r>
     </w:p>
     <w:sectPr>

</xml_diff>